<commit_message>
Update Eragonova website owner's handbook
</commit_message>
<xml_diff>
--- a/docs/Eragonova_Enterprise_Website_Owners_Handbook.docx
+++ b/docs/Eragonova_Enterprise_Website_Owners_Handbook.docx
@@ -140,7 +140,7 @@
                 <w:rFonts w:ascii="Liberation Sans" w:hAnsi="Liberation Sans"/>
                 <w:sz w:val="16"/>
               </w:rPr>
-              <w:t>https://edward-wonder-mordey.github.io/eragonova-website/</w:t>
+              <w:t>https://eragonova.com/</w:t>
             </w:r>
           </w:p>
         </w:tc>
@@ -340,7 +340,7 @@
                 <w:rFonts w:ascii="Liberation Sans" w:hAnsi="Liberation Sans"/>
                 <w:sz w:val="16"/>
               </w:rPr>
-              <w:t>Version 1.0 — 13 October 2026</w:t>
+              <w:t>Version 1.1 — 13 October 2026</w:t>
             </w:r>
           </w:p>
         </w:tc>
@@ -2780,7 +2780,7 @@
                 <w:rFonts w:ascii="Liberation Sans" w:hAnsi="Liberation Sans"/>
                 <w:sz w:val="15"/>
               </w:rPr>
-              <w:t>SEO title/description/social preview</w:t>
+              <w:t>Page SEO titles/descriptions</w:t>
             </w:r>
           </w:p>
         </w:tc>
@@ -2804,7 +2804,7 @@
                 <w:rFonts w:ascii="Liberation Sans" w:hAnsi="Liberation Sans"/>
                 <w:sz w:val="15"/>
               </w:rPr>
-              <w:t>public/index.html</w:t>
+              <w:t>src/data/routeMeta.js</w:t>
             </w:r>
           </w:p>
         </w:tc>
@@ -2828,7 +2828,7 @@
                 <w:rFonts w:ascii="Liberation Sans" w:hAnsi="Liberation Sans"/>
                 <w:sz w:val="15"/>
               </w:rPr>
-              <w:t>Main metadata for search and link sharing.</w:t>
+              <w:t>Main page-by-page search titles, descriptions and canonical paths.</w:t>
             </w:r>
           </w:p>
         </w:tc>
@@ -2854,7 +2854,7 @@
                 <w:rFonts w:ascii="Liberation Sans" w:hAnsi="Liberation Sans"/>
                 <w:sz w:val="15"/>
               </w:rPr>
-              <w:t>Search engine sitemap</w:t>
+              <w:t>Organisation/social SEO shell</w:t>
             </w:r>
           </w:p>
         </w:tc>
@@ -2878,7 +2878,7 @@
                 <w:rFonts w:ascii="Liberation Sans" w:hAnsi="Liberation Sans"/>
                 <w:sz w:val="15"/>
               </w:rPr>
-              <w:t>public/sitemap.xml</w:t>
+              <w:t>public/index.html</w:t>
             </w:r>
           </w:p>
         </w:tc>
@@ -2902,7 +2902,7 @@
                 <w:rFonts w:ascii="Liberation Sans" w:hAnsi="Liberation Sans"/>
                 <w:sz w:val="15"/>
               </w:rPr>
-              <w:t>Update when major public routes change.</w:t>
+              <w:t>Base metadata, organisation schema and social image.</w:t>
             </w:r>
           </w:p>
         </w:tc>
@@ -2928,7 +2928,7 @@
                 <w:rFonts w:ascii="Liberation Sans" w:hAnsi="Liberation Sans"/>
                 <w:sz w:val="15"/>
               </w:rPr>
-              <w:t>Google Search Console verification</w:t>
+              <w:t>Search engine sitemap</w:t>
             </w:r>
           </w:p>
         </w:tc>
@@ -2952,7 +2952,7 @@
                 <w:rFonts w:ascii="Liberation Sans" w:hAnsi="Liberation Sans"/>
                 <w:sz w:val="15"/>
               </w:rPr>
-              <w:t>public/googlebcb43e0ea049d806.html</w:t>
+              <w:t>public/sitemap.xml</w:t>
             </w:r>
           </w:p>
         </w:tc>
@@ -2976,7 +2976,7 @@
                 <w:rFonts w:ascii="Liberation Sans" w:hAnsi="Liberation Sans"/>
                 <w:sz w:val="15"/>
               </w:rPr>
-              <w:t>Do not remove unless changing verification method.</w:t>
+              <w:t>Update when major public routes change.</w:t>
             </w:r>
           </w:p>
         </w:tc>
@@ -3002,7 +3002,7 @@
                 <w:rFonts w:ascii="Liberation Sans" w:hAnsi="Liberation Sans"/>
                 <w:sz w:val="15"/>
               </w:rPr>
-              <w:t>Deployment</w:t>
+              <w:t>Google Search Console verification</w:t>
             </w:r>
           </w:p>
         </w:tc>
@@ -3026,7 +3026,7 @@
                 <w:rFonts w:ascii="Liberation Sans" w:hAnsi="Liberation Sans"/>
                 <w:sz w:val="15"/>
               </w:rPr>
-              <w:t xml:space="preserve"> .github/workflows/deploy-pages.yml</w:t>
+              <w:t>Spaceship DNS + Google Search Console</w:t>
             </w:r>
           </w:p>
         </w:tc>
@@ -3034,6 +3034,80 @@
           <w:tcPr>
             <w:tcW w:type="dxa" w:w="4252"/>
             <w:shd w:fill="FFFFFF"/>
+            <w:tcBorders>
+              <w:top w:val="single" w:sz="4" w:color="D7E0EA" w:space="0"/>
+              <w:left w:val="single" w:sz="4" w:color="D7E0EA" w:space="0"/>
+              <w:bottom w:val="single" w:sz="4" w:color="D7E0EA" w:space="0"/>
+              <w:right w:val="single" w:sz="4" w:color="D7E0EA" w:space="0"/>
+              <w:insideH w:val="single" w:sz="4" w:color="D7E0EA" w:space="0"/>
+              <w:insideV w:val="single" w:sz="4" w:color="D7E0EA" w:space="0"/>
+            </w:tcBorders>
+            <w:vAlign w:val="top"/>
+          </w:tcPr>
+          <w:p>
+            <w:r>
+              <w:rPr>
+                <w:rFonts w:ascii="Liberation Sans" w:hAnsi="Liberation Sans"/>
+                <w:sz w:val="15"/>
+              </w:rPr>
+              <w:t>Use Google Domain verification and add only the TXT record Google supplies.</w:t>
+            </w:r>
+          </w:p>
+        </w:tc>
+      </w:tr>
+      <w:tr>
+        <w:tc>
+          <w:tcPr>
+            <w:tcW w:type="dxa" w:w="2551"/>
+            <w:shd w:fill="F8FAFC"/>
+            <w:tcBorders>
+              <w:top w:val="single" w:sz="4" w:color="D7E0EA" w:space="0"/>
+              <w:left w:val="single" w:sz="4" w:color="D7E0EA" w:space="0"/>
+              <w:bottom w:val="single" w:sz="4" w:color="D7E0EA" w:space="0"/>
+              <w:right w:val="single" w:sz="4" w:color="D7E0EA" w:space="0"/>
+              <w:insideH w:val="single" w:sz="4" w:color="D7E0EA" w:space="0"/>
+              <w:insideV w:val="single" w:sz="4" w:color="D7E0EA" w:space="0"/>
+            </w:tcBorders>
+            <w:vAlign w:val="top"/>
+          </w:tcPr>
+          <w:p>
+            <w:r>
+              <w:rPr>
+                <w:rFonts w:ascii="Liberation Sans" w:hAnsi="Liberation Sans"/>
+                <w:sz w:val="15"/>
+              </w:rPr>
+              <w:t>Deployment</w:t>
+            </w:r>
+          </w:p>
+        </w:tc>
+        <w:tc>
+          <w:tcPr>
+            <w:tcW w:type="dxa" w:w="3061"/>
+            <w:shd w:fill="F8FAFC"/>
+            <w:tcBorders>
+              <w:top w:val="single" w:sz="4" w:color="D7E0EA" w:space="0"/>
+              <w:left w:val="single" w:sz="4" w:color="D7E0EA" w:space="0"/>
+              <w:bottom w:val="single" w:sz="4" w:color="D7E0EA" w:space="0"/>
+              <w:right w:val="single" w:sz="4" w:color="D7E0EA" w:space="0"/>
+              <w:insideH w:val="single" w:sz="4" w:color="D7E0EA" w:space="0"/>
+              <w:insideV w:val="single" w:sz="4" w:color="D7E0EA" w:space="0"/>
+            </w:tcBorders>
+            <w:vAlign w:val="top"/>
+          </w:tcPr>
+          <w:p>
+            <w:r>
+              <w:rPr>
+                <w:rFonts w:ascii="Liberation Sans" w:hAnsi="Liberation Sans"/>
+                <w:sz w:val="15"/>
+              </w:rPr>
+              <w:t xml:space="preserve"> .github/workflows/deploy-pages.yml</w:t>
+            </w:r>
+          </w:p>
+        </w:tc>
+        <w:tc>
+          <w:tcPr>
+            <w:tcW w:type="dxa" w:w="4252"/>
+            <w:shd w:fill="F8FAFC"/>
             <w:tcBorders>
               <w:top w:val="single" w:sz="4" w:color="D7E0EA" w:space="0"/>
               <w:left w:val="single" w:sz="4" w:color="D7E0EA" w:space="0"/>
@@ -3227,7 +3301,7 @@
                 <w:rFonts w:ascii="Liberation Sans" w:hAnsi="Liberation Sans"/>
                 <w:sz w:val="16"/>
               </w:rPr>
-              <w:t>Decides which page opens for #/about, #/services and other links.</w:t>
+              <w:t>Decides which clean page path opens for /about, /services and other links. Older #/... links are also supported.</w:t>
             </w:r>
           </w:p>
         </w:tc>
@@ -3602,7 +3676,7 @@
                 <w:color w:val="FFFFFF"/>
                 <w:sz w:val="16"/>
               </w:rPr>
-              <w:t>Website address after #/</w:t>
+              <w:t>Website path</w:t>
             </w:r>
           </w:p>
         </w:tc>
@@ -3680,7 +3754,7 @@
                 <w:rFonts w:ascii="Liberation Sans" w:hAnsi="Liberation Sans"/>
                 <w:sz w:val="15"/>
               </w:rPr>
-              <w:t>home</w:t>
+              <w:t>/</w:t>
             </w:r>
           </w:p>
         </w:tc>
@@ -3754,7 +3828,7 @@
                 <w:rFonts w:ascii="Liberation Sans" w:hAnsi="Liberation Sans"/>
                 <w:sz w:val="15"/>
               </w:rPr>
-              <w:t>about</w:t>
+              <w:t>/about</w:t>
             </w:r>
           </w:p>
         </w:tc>
@@ -3828,7 +3902,7 @@
                 <w:rFonts w:ascii="Liberation Sans" w:hAnsi="Liberation Sans"/>
                 <w:sz w:val="15"/>
               </w:rPr>
-              <w:t>services</w:t>
+              <w:t>/services</w:t>
             </w:r>
           </w:p>
         </w:tc>
@@ -3902,7 +3976,7 @@
                 <w:rFonts w:ascii="Liberation Sans" w:hAnsi="Liberation Sans"/>
                 <w:sz w:val="15"/>
               </w:rPr>
-              <w:t>projects</w:t>
+              <w:t>/projects</w:t>
             </w:r>
           </w:p>
         </w:tc>
@@ -3976,7 +4050,7 @@
                 <w:rFonts w:ascii="Liberation Sans" w:hAnsi="Liberation Sans"/>
                 <w:sz w:val="15"/>
               </w:rPr>
-              <w:t>academy</w:t>
+              <w:t>/academy</w:t>
             </w:r>
           </w:p>
         </w:tc>
@@ -4050,7 +4124,7 @@
                 <w:rFonts w:ascii="Liberation Sans" w:hAnsi="Liberation Sans"/>
                 <w:sz w:val="15"/>
               </w:rPr>
-              <w:t>resources</w:t>
+              <w:t>/resources</w:t>
             </w:r>
           </w:p>
         </w:tc>
@@ -4098,7 +4172,7 @@
                 <w:rFonts w:ascii="Liberation Sans" w:hAnsi="Liberation Sans"/>
                 <w:sz w:val="15"/>
               </w:rPr>
-              <w:t>src/pages/ClientFacingPages.jsx</w:t>
+              <w:t>src/pages/ResourcesPage.jsx</w:t>
             </w:r>
           </w:p>
         </w:tc>
@@ -4124,7 +4198,7 @@
                 <w:rFonts w:ascii="Liberation Sans" w:hAnsi="Liberation Sans"/>
                 <w:sz w:val="15"/>
               </w:rPr>
-              <w:t>community</w:t>
+              <w:t>/community</w:t>
             </w:r>
           </w:p>
         </w:tc>
@@ -4198,7 +4272,7 @@
                 <w:rFonts w:ascii="Liberation Sans" w:hAnsi="Liberation Sans"/>
                 <w:sz w:val="15"/>
               </w:rPr>
-              <w:t>partners</w:t>
+              <w:t>/partners</w:t>
             </w:r>
           </w:p>
         </w:tc>
@@ -4272,7 +4346,7 @@
                 <w:rFonts w:ascii="Liberation Sans" w:hAnsi="Liberation Sans"/>
                 <w:sz w:val="15"/>
               </w:rPr>
-              <w:t>careers</w:t>
+              <w:t>/careers</w:t>
             </w:r>
           </w:p>
         </w:tc>
@@ -4346,7 +4420,7 @@
                 <w:rFonts w:ascii="Liberation Sans" w:hAnsi="Liberation Sans"/>
                 <w:sz w:val="15"/>
               </w:rPr>
-              <w:t>portal</w:t>
+              <w:t>/portal</w:t>
             </w:r>
           </w:p>
         </w:tc>
@@ -4420,7 +4494,7 @@
                 <w:rFonts w:ascii="Liberation Sans" w:hAnsi="Liberation Sans"/>
                 <w:sz w:val="15"/>
               </w:rPr>
-              <w:t>contact</w:t>
+              <w:t>/contact</w:t>
             </w:r>
           </w:p>
         </w:tc>
@@ -4494,7 +4568,7 @@
                 <w:rFonts w:ascii="Liberation Sans" w:hAnsi="Liberation Sans"/>
                 <w:sz w:val="15"/>
               </w:rPr>
-              <w:t>legal</w:t>
+              <w:t>/legal</w:t>
             </w:r>
           </w:p>
         </w:tc>
@@ -4568,7 +4642,7 @@
                 <w:rFonts w:ascii="Liberation Sans" w:hAnsi="Liberation Sans"/>
                 <w:sz w:val="15"/>
               </w:rPr>
-              <w:t>privacy</w:t>
+              <w:t>/privacy</w:t>
             </w:r>
           </w:p>
         </w:tc>
@@ -4642,7 +4716,7 @@
                 <w:rFonts w:ascii="Liberation Sans" w:hAnsi="Liberation Sans"/>
                 <w:sz w:val="15"/>
               </w:rPr>
-              <w:t>terms</w:t>
+              <w:t>/terms</w:t>
             </w:r>
           </w:p>
         </w:tc>
@@ -5354,7 +5428,7 @@
                 <w:rFonts w:ascii="Liberation Sans" w:hAnsi="Liberation Sans"/>
                 <w:sz w:val="16"/>
               </w:rPr>
-              <w:t>https://edward-wonder-mordey.github.io/eragonova-website/</w:t>
+              <w:t>https://eragonova.com/</w:t>
             </w:r>
           </w:p>
         </w:tc>
@@ -5378,7 +5452,7 @@
                 <w:rFonts w:ascii="Liberation Sans" w:hAnsi="Liberation Sans"/>
                 <w:sz w:val="16"/>
               </w:rPr>
-              <w:t>package.json, public/index.html, sitemap/robots as applicable</w:t>
+              <w:t>public/CNAME, package.json, public/index.html, sitemap/robots</w:t>
             </w:r>
           </w:p>
         </w:tc>
@@ -6083,7 +6157,7 @@
                 <w:rFonts w:ascii="Liberation Sans" w:hAnsi="Liberation Sans"/>
                 <w:sz w:val="15"/>
               </w:rPr>
-              <w:t>Projects, Resources, Community, Careers</w:t>
+              <w:t>Projects, Community and Careers</w:t>
             </w:r>
           </w:p>
         </w:tc>
@@ -6133,7 +6207,7 @@
                 <w:rFonts w:ascii="Liberation Sans" w:hAnsi="Liberation Sans"/>
                 <w:sz w:val="15"/>
               </w:rPr>
-              <w:t>src/pages/PartnersPage.jsx</w:t>
+              <w:t>src/pages/ResourcesPage.jsx</w:t>
             </w:r>
           </w:p>
         </w:tc>
@@ -6157,7 +6231,7 @@
                 <w:rFonts w:ascii="Liberation Sans" w:hAnsi="Liberation Sans"/>
                 <w:sz w:val="15"/>
               </w:rPr>
-              <w:t>Strategic Partners / Elyra Suite</w:t>
+              <w:t>Resources and starter checklists</w:t>
             </w:r>
           </w:p>
         </w:tc>
@@ -6181,7 +6255,7 @@
                 <w:rFonts w:ascii="Liberation Sans" w:hAnsi="Liberation Sans"/>
                 <w:sz w:val="15"/>
               </w:rPr>
-              <w:t>GREEN</w:t>
+              <w:t>GREEN/AMBER</w:t>
             </w:r>
           </w:p>
         </w:tc>
@@ -6207,7 +6281,7 @@
                 <w:rFonts w:ascii="Liberation Sans" w:hAnsi="Liberation Sans"/>
                 <w:sz w:val="15"/>
               </w:rPr>
-              <w:t>src/pages/PortalPage.jsx</w:t>
+              <w:t>src/pages/PartnersPage.jsx</w:t>
             </w:r>
           </w:p>
         </w:tc>
@@ -6231,7 +6305,7 @@
                 <w:rFonts w:ascii="Liberation Sans" w:hAnsi="Liberation Sans"/>
                 <w:sz w:val="15"/>
               </w:rPr>
-              <w:t>Client Portal public experience</w:t>
+              <w:t>Strategic Partners / Elyra Suite</w:t>
             </w:r>
           </w:p>
         </w:tc>
@@ -6255,7 +6329,7 @@
                 <w:rFonts w:ascii="Liberation Sans" w:hAnsi="Liberation Sans"/>
                 <w:sz w:val="15"/>
               </w:rPr>
-              <w:t>AMBER</w:t>
+              <w:t>GREEN</w:t>
             </w:r>
           </w:p>
         </w:tc>
@@ -6281,7 +6355,7 @@
                 <w:rFonts w:ascii="Liberation Sans" w:hAnsi="Liberation Sans"/>
                 <w:sz w:val="15"/>
               </w:rPr>
-              <w:t>src/pages/PrivacyPage.jsx</w:t>
+              <w:t>src/pages/PortalPage.jsx</w:t>
             </w:r>
           </w:p>
         </w:tc>
@@ -6305,7 +6379,7 @@
                 <w:rFonts w:ascii="Liberation Sans" w:hAnsi="Liberation Sans"/>
                 <w:sz w:val="15"/>
               </w:rPr>
-              <w:t>Privacy policy</w:t>
+              <w:t>Client Portal public experience</w:t>
             </w:r>
           </w:p>
         </w:tc>
@@ -6329,7 +6403,7 @@
                 <w:rFonts w:ascii="Liberation Sans" w:hAnsi="Liberation Sans"/>
                 <w:sz w:val="15"/>
               </w:rPr>
-              <w:t>GREEN/AMBER</w:t>
+              <w:t>AMBER</w:t>
             </w:r>
           </w:p>
         </w:tc>
@@ -6355,7 +6429,7 @@
                 <w:rFonts w:ascii="Liberation Sans" w:hAnsi="Liberation Sans"/>
                 <w:sz w:val="15"/>
               </w:rPr>
-              <w:t>src/pages/TermsPage.jsx</w:t>
+              <w:t>src/pages/PrivacyPage.jsx</w:t>
             </w:r>
           </w:p>
         </w:tc>
@@ -6379,7 +6453,7 @@
                 <w:rFonts w:ascii="Liberation Sans" w:hAnsi="Liberation Sans"/>
                 <w:sz w:val="15"/>
               </w:rPr>
-              <w:t>Terms</w:t>
+              <w:t>Privacy policy</w:t>
             </w:r>
           </w:p>
         </w:tc>
@@ -6429,7 +6503,7 @@
                 <w:rFonts w:ascii="Liberation Sans" w:hAnsi="Liberation Sans"/>
                 <w:sz w:val="15"/>
               </w:rPr>
-              <w:t>src/pages/CorporatePages.jsx</w:t>
+              <w:t>src/pages/TermsPage.jsx</w:t>
             </w:r>
           </w:p>
         </w:tc>
@@ -6453,7 +6527,7 @@
                 <w:rFonts w:ascii="Liberation Sans" w:hAnsi="Liberation Sans"/>
                 <w:sz w:val="15"/>
               </w:rPr>
-              <w:t>Current Contact + Legal; also contains older duplicate page code</w:t>
+              <w:t>Terms</w:t>
             </w:r>
           </w:p>
         </w:tc>
@@ -6477,7 +6551,7 @@
                 <w:rFonts w:ascii="Liberation Sans" w:hAnsi="Liberation Sans"/>
                 <w:sz w:val="15"/>
               </w:rPr>
-              <w:t>CAUTION</w:t>
+              <w:t>GREEN/AMBER</w:t>
             </w:r>
           </w:p>
         </w:tc>
@@ -6503,7 +6577,7 @@
                 <w:rFonts w:ascii="Liberation Sans" w:hAnsi="Liberation Sans"/>
                 <w:sz w:val="15"/>
               </w:rPr>
-              <w:t>src/data/siteData.js</w:t>
+              <w:t>src/pages/CorporatePages.jsx</w:t>
             </w:r>
           </w:p>
         </w:tc>
@@ -6527,7 +6601,7 @@
                 <w:rFonts w:ascii="Liberation Sans" w:hAnsi="Liberation Sans"/>
                 <w:sz w:val="15"/>
               </w:rPr>
-              <w:t>16 divisions, pillars, sectors, Academy tracks, resources and community programmes</w:t>
+              <w:t>Current Contact + Legal; also contains older duplicate page code</w:t>
             </w:r>
           </w:p>
         </w:tc>
@@ -6551,7 +6625,7 @@
                 <w:rFonts w:ascii="Liberation Sans" w:hAnsi="Liberation Sans"/>
                 <w:sz w:val="15"/>
               </w:rPr>
-              <w:t>GREEN/AMBER</w:t>
+              <w:t>CAUTION</w:t>
             </w:r>
           </w:p>
         </w:tc>
@@ -6577,7 +6651,7 @@
                 <w:rFonts w:ascii="Liberation Sans" w:hAnsi="Liberation Sans"/>
                 <w:sz w:val="15"/>
               </w:rPr>
-              <w:t>src/components/Header.jsx</w:t>
+              <w:t>src/data/siteData.js</w:t>
             </w:r>
           </w:p>
         </w:tc>
@@ -6601,7 +6675,7 @@
                 <w:rFonts w:ascii="Liberation Sans" w:hAnsi="Liberation Sans"/>
                 <w:sz w:val="15"/>
               </w:rPr>
-              <w:t>Navigation + dark-mode toggle</w:t>
+              <w:t>16 divisions, pillars, sectors, Academy tracks, resources and community programmes</w:t>
             </w:r>
           </w:p>
         </w:tc>
@@ -6625,7 +6699,7 @@
                 <w:rFonts w:ascii="Liberation Sans" w:hAnsi="Liberation Sans"/>
                 <w:sz w:val="15"/>
               </w:rPr>
-              <w:t>AMBER</w:t>
+              <w:t>GREEN/AMBER</w:t>
             </w:r>
           </w:p>
         </w:tc>
@@ -6651,7 +6725,7 @@
                 <w:rFonts w:ascii="Liberation Sans" w:hAnsi="Liberation Sans"/>
                 <w:sz w:val="15"/>
               </w:rPr>
-              <w:t>src/components/ContactSection.jsx</w:t>
+              <w:t>src/components/Header.jsx</w:t>
             </w:r>
           </w:p>
         </w:tc>
@@ -6675,7 +6749,7 @@
                 <w:rFonts w:ascii="Liberation Sans" w:hAnsi="Liberation Sans"/>
                 <w:sz w:val="15"/>
               </w:rPr>
-              <w:t>Contact details + Formspree form</w:t>
+              <w:t>Navigation + dark-mode toggle</w:t>
             </w:r>
           </w:p>
         </w:tc>
@@ -6725,7 +6799,7 @@
                 <w:rFonts w:ascii="Liberation Sans" w:hAnsi="Liberation Sans"/>
                 <w:sz w:val="15"/>
               </w:rPr>
-              <w:t>src/components/HeroSection.new.jsx</w:t>
+              <w:t>src/components/ContactSection.jsx</w:t>
             </w:r>
           </w:p>
         </w:tc>
@@ -6749,7 +6823,7 @@
                 <w:rFonts w:ascii="Liberation Sans" w:hAnsi="Liberation Sans"/>
                 <w:sz w:val="15"/>
               </w:rPr>
-              <w:t>Current homepage hero</w:t>
+              <w:t>Contact details + Formspree form</w:t>
             </w:r>
           </w:p>
         </w:tc>
@@ -6773,7 +6847,7 @@
                 <w:rFonts w:ascii="Liberation Sans" w:hAnsi="Liberation Sans"/>
                 <w:sz w:val="15"/>
               </w:rPr>
-              <w:t>GREEN/AMBER</w:t>
+              <w:t>AMBER</w:t>
             </w:r>
           </w:p>
         </w:tc>
@@ -6799,7 +6873,7 @@
                 <w:rFonts w:ascii="Liberation Sans" w:hAnsi="Liberation Sans"/>
                 <w:sz w:val="15"/>
               </w:rPr>
-              <w:t>src/components/ProjectsSection.new.jsx</w:t>
+              <w:t>src/components/HeroSection.new.jsx</w:t>
             </w:r>
           </w:p>
         </w:tc>
@@ -6823,7 +6897,7 @@
                 <w:rFonts w:ascii="Liberation Sans" w:hAnsi="Liberation Sans"/>
                 <w:sz w:val="15"/>
               </w:rPr>
-              <w:t>Current project showcase</w:t>
+              <w:t>Current homepage hero</w:t>
             </w:r>
           </w:p>
         </w:tc>
@@ -6873,7 +6947,7 @@
                 <w:rFonts w:ascii="Liberation Sans" w:hAnsi="Liberation Sans"/>
                 <w:sz w:val="15"/>
               </w:rPr>
-              <w:t>src/components/CapabilityVisual.jsx</w:t>
+              <w:t>src/components/ProjectsSection.new.jsx</w:t>
             </w:r>
           </w:p>
         </w:tc>
@@ -6897,7 +6971,7 @@
                 <w:rFonts w:ascii="Liberation Sans" w:hAnsi="Liberation Sans"/>
                 <w:sz w:val="15"/>
               </w:rPr>
-              <w:t>Reusable service/capability graphics</w:t>
+              <w:t>Current project showcase</w:t>
             </w:r>
           </w:p>
         </w:tc>
@@ -6921,7 +6995,7 @@
                 <w:rFonts w:ascii="Liberation Sans" w:hAnsi="Liberation Sans"/>
                 <w:sz w:val="15"/>
               </w:rPr>
-              <w:t>AMBER</w:t>
+              <w:t>GREEN/AMBER</w:t>
             </w:r>
           </w:p>
         </w:tc>
@@ -6947,7 +7021,7 @@
                 <w:rFonts w:ascii="Liberation Sans" w:hAnsi="Liberation Sans"/>
                 <w:sz w:val="15"/>
               </w:rPr>
-              <w:t>src/index.css</w:t>
+              <w:t>src/components/CapabilityVisual.jsx</w:t>
             </w:r>
           </w:p>
         </w:tc>
@@ -6971,7 +7045,7 @@
                 <w:rFonts w:ascii="Liberation Sans" w:hAnsi="Liberation Sans"/>
                 <w:sz w:val="15"/>
               </w:rPr>
-              <w:t>Global styling</w:t>
+              <w:t>Reusable service/capability graphics</w:t>
             </w:r>
           </w:p>
         </w:tc>
@@ -6995,7 +7069,451 @@
                 <w:rFonts w:ascii="Liberation Sans" w:hAnsi="Liberation Sans"/>
                 <w:sz w:val="15"/>
               </w:rPr>
+              <w:t>AMBER</w:t>
+            </w:r>
+          </w:p>
+        </w:tc>
+      </w:tr>
+      <w:tr>
+        <w:tc>
+          <w:tcPr>
+            <w:tcW w:type="dxa" w:w="3515"/>
+            <w:shd w:fill="FFFFFF"/>
+            <w:tcBorders>
+              <w:top w:val="single" w:sz="4" w:color="D7E0EA" w:space="0"/>
+              <w:left w:val="single" w:sz="4" w:color="D7E0EA" w:space="0"/>
+              <w:bottom w:val="single" w:sz="4" w:color="D7E0EA" w:space="0"/>
+              <w:right w:val="single" w:sz="4" w:color="D7E0EA" w:space="0"/>
+              <w:insideH w:val="single" w:sz="4" w:color="D7E0EA" w:space="0"/>
+              <w:insideV w:val="single" w:sz="4" w:color="D7E0EA" w:space="0"/>
+            </w:tcBorders>
+            <w:vAlign w:val="top"/>
+          </w:tcPr>
+          <w:p>
+            <w:r>
+              <w:rPr>
+                <w:rFonts w:ascii="Liberation Sans" w:hAnsi="Liberation Sans"/>
+                <w:sz w:val="15"/>
+              </w:rPr>
+              <w:t>src/index.css</w:t>
+            </w:r>
+          </w:p>
+        </w:tc>
+        <w:tc>
+          <w:tcPr>
+            <w:tcW w:type="dxa" w:w="4819"/>
+            <w:shd w:fill="FFFFFF"/>
+            <w:tcBorders>
+              <w:top w:val="single" w:sz="4" w:color="D7E0EA" w:space="0"/>
+              <w:left w:val="single" w:sz="4" w:color="D7E0EA" w:space="0"/>
+              <w:bottom w:val="single" w:sz="4" w:color="D7E0EA" w:space="0"/>
+              <w:right w:val="single" w:sz="4" w:color="D7E0EA" w:space="0"/>
+              <w:insideH w:val="single" w:sz="4" w:color="D7E0EA" w:space="0"/>
+              <w:insideV w:val="single" w:sz="4" w:color="D7E0EA" w:space="0"/>
+            </w:tcBorders>
+            <w:vAlign w:val="top"/>
+          </w:tcPr>
+          <w:p>
+            <w:r>
+              <w:rPr>
+                <w:rFonts w:ascii="Liberation Sans" w:hAnsi="Liberation Sans"/>
+                <w:sz w:val="15"/>
+              </w:rPr>
+              <w:t>Global styling</w:t>
+            </w:r>
+          </w:p>
+        </w:tc>
+        <w:tc>
+          <w:tcPr>
+            <w:tcW w:type="dxa" w:w="1531"/>
+            <w:shd w:fill="FFFFFF"/>
+            <w:tcBorders>
+              <w:top w:val="single" w:sz="4" w:color="D7E0EA" w:space="0"/>
+              <w:left w:val="single" w:sz="4" w:color="D7E0EA" w:space="0"/>
+              <w:bottom w:val="single" w:sz="4" w:color="D7E0EA" w:space="0"/>
+              <w:right w:val="single" w:sz="4" w:color="D7E0EA" w:space="0"/>
+              <w:insideH w:val="single" w:sz="4" w:color="D7E0EA" w:space="0"/>
+              <w:insideV w:val="single" w:sz="4" w:color="D7E0EA" w:space="0"/>
+            </w:tcBorders>
+            <w:vAlign w:val="top"/>
+          </w:tcPr>
+          <w:p>
+            <w:r>
+              <w:rPr>
+                <w:rFonts w:ascii="Liberation Sans" w:hAnsi="Liberation Sans"/>
+                <w:sz w:val="15"/>
+              </w:rPr>
               <w:t>AMBER/RED</w:t>
+            </w:r>
+          </w:p>
+        </w:tc>
+      </w:tr>
+      <w:tr>
+        <w:tc>
+          <w:tcPr>
+            <w:tcW w:type="dxa" w:w="3515"/>
+            <w:shd w:fill="F8FAFC"/>
+            <w:tcBorders>
+              <w:top w:val="single" w:sz="4" w:color="D7E0EA" w:space="0"/>
+              <w:left w:val="single" w:sz="4" w:color="D7E0EA" w:space="0"/>
+              <w:bottom w:val="single" w:sz="4" w:color="D7E0EA" w:space="0"/>
+              <w:right w:val="single" w:sz="4" w:color="D7E0EA" w:space="0"/>
+              <w:insideH w:val="single" w:sz="4" w:color="D7E0EA" w:space="0"/>
+              <w:insideV w:val="single" w:sz="4" w:color="D7E0EA" w:space="0"/>
+            </w:tcBorders>
+            <w:vAlign w:val="top"/>
+          </w:tcPr>
+          <w:p>
+            <w:r>
+              <w:rPr>
+                <w:rFonts w:ascii="Liberation Sans" w:hAnsi="Liberation Sans"/>
+                <w:sz w:val="15"/>
+              </w:rPr>
+              <w:t>src/accessibility.css</w:t>
+            </w:r>
+          </w:p>
+        </w:tc>
+        <w:tc>
+          <w:tcPr>
+            <w:tcW w:type="dxa" w:w="4819"/>
+            <w:shd w:fill="F8FAFC"/>
+            <w:tcBorders>
+              <w:top w:val="single" w:sz="4" w:color="D7E0EA" w:space="0"/>
+              <w:left w:val="single" w:sz="4" w:color="D7E0EA" w:space="0"/>
+              <w:bottom w:val="single" w:sz="4" w:color="D7E0EA" w:space="0"/>
+              <w:right w:val="single" w:sz="4" w:color="D7E0EA" w:space="0"/>
+              <w:insideH w:val="single" w:sz="4" w:color="D7E0EA" w:space="0"/>
+              <w:insideV w:val="single" w:sz="4" w:color="D7E0EA" w:space="0"/>
+            </w:tcBorders>
+            <w:vAlign w:val="top"/>
+          </w:tcPr>
+          <w:p>
+            <w:r>
+              <w:rPr>
+                <w:rFonts w:ascii="Liberation Sans" w:hAnsi="Liberation Sans"/>
+                <w:sz w:val="15"/>
+              </w:rPr>
+              <w:t>Accessibility, focus and reduced-motion styles</w:t>
+            </w:r>
+          </w:p>
+        </w:tc>
+        <w:tc>
+          <w:tcPr>
+            <w:tcW w:type="dxa" w:w="1531"/>
+            <w:shd w:fill="F8FAFC"/>
+            <w:tcBorders>
+              <w:top w:val="single" w:sz="4" w:color="D7E0EA" w:space="0"/>
+              <w:left w:val="single" w:sz="4" w:color="D7E0EA" w:space="0"/>
+              <w:bottom w:val="single" w:sz="4" w:color="D7E0EA" w:space="0"/>
+              <w:right w:val="single" w:sz="4" w:color="D7E0EA" w:space="0"/>
+              <w:insideH w:val="single" w:sz="4" w:color="D7E0EA" w:space="0"/>
+              <w:insideV w:val="single" w:sz="4" w:color="D7E0EA" w:space="0"/>
+            </w:tcBorders>
+            <w:vAlign w:val="top"/>
+          </w:tcPr>
+          <w:p>
+            <w:r>
+              <w:rPr>
+                <w:rFonts w:ascii="Liberation Sans" w:hAnsi="Liberation Sans"/>
+                <w:sz w:val="15"/>
+              </w:rPr>
+              <w:t>AMBER</w:t>
+            </w:r>
+          </w:p>
+        </w:tc>
+      </w:tr>
+      <w:tr>
+        <w:tc>
+          <w:tcPr>
+            <w:tcW w:type="dxa" w:w="3515"/>
+            <w:shd w:fill="FFFFFF"/>
+            <w:tcBorders>
+              <w:top w:val="single" w:sz="4" w:color="D7E0EA" w:space="0"/>
+              <w:left w:val="single" w:sz="4" w:color="D7E0EA" w:space="0"/>
+              <w:bottom w:val="single" w:sz="4" w:color="D7E0EA" w:space="0"/>
+              <w:right w:val="single" w:sz="4" w:color="D7E0EA" w:space="0"/>
+              <w:insideH w:val="single" w:sz="4" w:color="D7E0EA" w:space="0"/>
+              <w:insideV w:val="single" w:sz="4" w:color="D7E0EA" w:space="0"/>
+            </w:tcBorders>
+            <w:vAlign w:val="top"/>
+          </w:tcPr>
+          <w:p>
+            <w:r>
+              <w:rPr>
+                <w:rFonts w:ascii="Liberation Sans" w:hAnsi="Liberation Sans"/>
+                <w:sz w:val="15"/>
+              </w:rPr>
+              <w:t>src/data/routeMeta.js</w:t>
+            </w:r>
+          </w:p>
+        </w:tc>
+        <w:tc>
+          <w:tcPr>
+            <w:tcW w:type="dxa" w:w="4819"/>
+            <w:shd w:fill="FFFFFF"/>
+            <w:tcBorders>
+              <w:top w:val="single" w:sz="4" w:color="D7E0EA" w:space="0"/>
+              <w:left w:val="single" w:sz="4" w:color="D7E0EA" w:space="0"/>
+              <w:bottom w:val="single" w:sz="4" w:color="D7E0EA" w:space="0"/>
+              <w:right w:val="single" w:sz="4" w:color="D7E0EA" w:space="0"/>
+              <w:insideH w:val="single" w:sz="4" w:color="D7E0EA" w:space="0"/>
+              <w:insideV w:val="single" w:sz="4" w:color="D7E0EA" w:space="0"/>
+            </w:tcBorders>
+            <w:vAlign w:val="top"/>
+          </w:tcPr>
+          <w:p>
+            <w:r>
+              <w:rPr>
+                <w:rFonts w:ascii="Liberation Sans" w:hAnsi="Liberation Sans"/>
+                <w:sz w:val="15"/>
+              </w:rPr>
+              <w:t>Page-specific SEO and canonical paths</w:t>
+            </w:r>
+          </w:p>
+        </w:tc>
+        <w:tc>
+          <w:tcPr>
+            <w:tcW w:type="dxa" w:w="1531"/>
+            <w:shd w:fill="FFFFFF"/>
+            <w:tcBorders>
+              <w:top w:val="single" w:sz="4" w:color="D7E0EA" w:space="0"/>
+              <w:left w:val="single" w:sz="4" w:color="D7E0EA" w:space="0"/>
+              <w:bottom w:val="single" w:sz="4" w:color="D7E0EA" w:space="0"/>
+              <w:right w:val="single" w:sz="4" w:color="D7E0EA" w:space="0"/>
+              <w:insideH w:val="single" w:sz="4" w:color="D7E0EA" w:space="0"/>
+              <w:insideV w:val="single" w:sz="4" w:color="D7E0EA" w:space="0"/>
+            </w:tcBorders>
+            <w:vAlign w:val="top"/>
+          </w:tcPr>
+          <w:p>
+            <w:r>
+              <w:rPr>
+                <w:rFonts w:ascii="Liberation Sans" w:hAnsi="Liberation Sans"/>
+                <w:sz w:val="15"/>
+              </w:rPr>
+              <w:t>AMBER</w:t>
+            </w:r>
+          </w:p>
+        </w:tc>
+      </w:tr>
+      <w:tr>
+        <w:tc>
+          <w:tcPr>
+            <w:tcW w:type="dxa" w:w="3515"/>
+            <w:shd w:fill="F8FAFC"/>
+            <w:tcBorders>
+              <w:top w:val="single" w:sz="4" w:color="D7E0EA" w:space="0"/>
+              <w:left w:val="single" w:sz="4" w:color="D7E0EA" w:space="0"/>
+              <w:bottom w:val="single" w:sz="4" w:color="D7E0EA" w:space="0"/>
+              <w:right w:val="single" w:sz="4" w:color="D7E0EA" w:space="0"/>
+              <w:insideH w:val="single" w:sz="4" w:color="D7E0EA" w:space="0"/>
+              <w:insideV w:val="single" w:sz="4" w:color="D7E0EA" w:space="0"/>
+            </w:tcBorders>
+            <w:vAlign w:val="top"/>
+          </w:tcPr>
+          <w:p>
+            <w:r>
+              <w:rPr>
+                <w:rFonts w:ascii="Liberation Sans" w:hAnsi="Liberation Sans"/>
+                <w:sz w:val="15"/>
+              </w:rPr>
+              <w:t>src/analytics.js</w:t>
+            </w:r>
+          </w:p>
+        </w:tc>
+        <w:tc>
+          <w:tcPr>
+            <w:tcW w:type="dxa" w:w="4819"/>
+            <w:shd w:fill="F8FAFC"/>
+            <w:tcBorders>
+              <w:top w:val="single" w:sz="4" w:color="D7E0EA" w:space="0"/>
+              <w:left w:val="single" w:sz="4" w:color="D7E0EA" w:space="0"/>
+              <w:bottom w:val="single" w:sz="4" w:color="D7E0EA" w:space="0"/>
+              <w:right w:val="single" w:sz="4" w:color="D7E0EA" w:space="0"/>
+              <w:insideH w:val="single" w:sz="4" w:color="D7E0EA" w:space="0"/>
+              <w:insideV w:val="single" w:sz="4" w:color="D7E0EA" w:space="0"/>
+            </w:tcBorders>
+            <w:vAlign w:val="top"/>
+          </w:tcPr>
+          <w:p>
+            <w:r>
+              <w:rPr>
+                <w:rFonts w:ascii="Liberation Sans" w:hAnsi="Liberation Sans"/>
+                <w:sz w:val="15"/>
+              </w:rPr>
+              <w:t>Optional GA4 loading and events</w:t>
+            </w:r>
+          </w:p>
+        </w:tc>
+        <w:tc>
+          <w:tcPr>
+            <w:tcW w:type="dxa" w:w="1531"/>
+            <w:shd w:fill="F8FAFC"/>
+            <w:tcBorders>
+              <w:top w:val="single" w:sz="4" w:color="D7E0EA" w:space="0"/>
+              <w:left w:val="single" w:sz="4" w:color="D7E0EA" w:space="0"/>
+              <w:bottom w:val="single" w:sz="4" w:color="D7E0EA" w:space="0"/>
+              <w:right w:val="single" w:sz="4" w:color="D7E0EA" w:space="0"/>
+              <w:insideH w:val="single" w:sz="4" w:color="D7E0EA" w:space="0"/>
+              <w:insideV w:val="single" w:sz="4" w:color="D7E0EA" w:space="0"/>
+            </w:tcBorders>
+            <w:vAlign w:val="top"/>
+          </w:tcPr>
+          <w:p>
+            <w:r>
+              <w:rPr>
+                <w:rFonts w:ascii="Liberation Sans" w:hAnsi="Liberation Sans"/>
+                <w:sz w:val="15"/>
+              </w:rPr>
+              <w:t>RED</w:t>
+            </w:r>
+          </w:p>
+        </w:tc>
+      </w:tr>
+      <w:tr>
+        <w:tc>
+          <w:tcPr>
+            <w:tcW w:type="dxa" w:w="3515"/>
+            <w:shd w:fill="FFFFFF"/>
+            <w:tcBorders>
+              <w:top w:val="single" w:sz="4" w:color="D7E0EA" w:space="0"/>
+              <w:left w:val="single" w:sz="4" w:color="D7E0EA" w:space="0"/>
+              <w:bottom w:val="single" w:sz="4" w:color="D7E0EA" w:space="0"/>
+              <w:right w:val="single" w:sz="4" w:color="D7E0EA" w:space="0"/>
+              <w:insideH w:val="single" w:sz="4" w:color="D7E0EA" w:space="0"/>
+              <w:insideV w:val="single" w:sz="4" w:color="D7E0EA" w:space="0"/>
+            </w:tcBorders>
+            <w:vAlign w:val="top"/>
+          </w:tcPr>
+          <w:p>
+            <w:r>
+              <w:rPr>
+                <w:rFonts w:ascii="Liberation Sans" w:hAnsi="Liberation Sans"/>
+                <w:sz w:val="15"/>
+              </w:rPr>
+              <w:t>public/site-config.js</w:t>
+            </w:r>
+          </w:p>
+        </w:tc>
+        <w:tc>
+          <w:tcPr>
+            <w:tcW w:type="dxa" w:w="4819"/>
+            <w:shd w:fill="FFFFFF"/>
+            <w:tcBorders>
+              <w:top w:val="single" w:sz="4" w:color="D7E0EA" w:space="0"/>
+              <w:left w:val="single" w:sz="4" w:color="D7E0EA" w:space="0"/>
+              <w:bottom w:val="single" w:sz="4" w:color="D7E0EA" w:space="0"/>
+              <w:right w:val="single" w:sz="4" w:color="D7E0EA" w:space="0"/>
+              <w:insideH w:val="single" w:sz="4" w:color="D7E0EA" w:space="0"/>
+              <w:insideV w:val="single" w:sz="4" w:color="D7E0EA" w:space="0"/>
+            </w:tcBorders>
+            <w:vAlign w:val="top"/>
+          </w:tcPr>
+          <w:p>
+            <w:r>
+              <w:rPr>
+                <w:rFonts w:ascii="Liberation Sans" w:hAnsi="Liberation Sans"/>
+                <w:sz w:val="15"/>
+              </w:rPr>
+              <w:t>Public GA4 Measurement ID setting</w:t>
+            </w:r>
+          </w:p>
+        </w:tc>
+        <w:tc>
+          <w:tcPr>
+            <w:tcW w:type="dxa" w:w="1531"/>
+            <w:shd w:fill="FFFFFF"/>
+            <w:tcBorders>
+              <w:top w:val="single" w:sz="4" w:color="D7E0EA" w:space="0"/>
+              <w:left w:val="single" w:sz="4" w:color="D7E0EA" w:space="0"/>
+              <w:bottom w:val="single" w:sz="4" w:color="D7E0EA" w:space="0"/>
+              <w:right w:val="single" w:sz="4" w:color="D7E0EA" w:space="0"/>
+              <w:insideH w:val="single" w:sz="4" w:color="D7E0EA" w:space="0"/>
+              <w:insideV w:val="single" w:sz="4" w:color="D7E0EA" w:space="0"/>
+            </w:tcBorders>
+            <w:vAlign w:val="top"/>
+          </w:tcPr>
+          <w:p>
+            <w:r>
+              <w:rPr>
+                <w:rFonts w:ascii="Liberation Sans" w:hAnsi="Liberation Sans"/>
+                <w:sz w:val="15"/>
+              </w:rPr>
+              <w:t>AMBER</w:t>
+            </w:r>
+          </w:p>
+        </w:tc>
+      </w:tr>
+      <w:tr>
+        <w:tc>
+          <w:tcPr>
+            <w:tcW w:type="dxa" w:w="3515"/>
+            <w:shd w:fill="F8FAFC"/>
+            <w:tcBorders>
+              <w:top w:val="single" w:sz="4" w:color="D7E0EA" w:space="0"/>
+              <w:left w:val="single" w:sz="4" w:color="D7E0EA" w:space="0"/>
+              <w:bottom w:val="single" w:sz="4" w:color="D7E0EA" w:space="0"/>
+              <w:right w:val="single" w:sz="4" w:color="D7E0EA" w:space="0"/>
+              <w:insideH w:val="single" w:sz="4" w:color="D7E0EA" w:space="0"/>
+              <w:insideV w:val="single" w:sz="4" w:color="D7E0EA" w:space="0"/>
+            </w:tcBorders>
+            <w:vAlign w:val="top"/>
+          </w:tcPr>
+          <w:p>
+            <w:r>
+              <w:rPr>
+                <w:rFonts w:ascii="Liberation Sans" w:hAnsi="Liberation Sans"/>
+                <w:sz w:val="15"/>
+              </w:rPr>
+              <w:t>scripts/postbuild.cjs</w:t>
+            </w:r>
+          </w:p>
+        </w:tc>
+        <w:tc>
+          <w:tcPr>
+            <w:tcW w:type="dxa" w:w="4819"/>
+            <w:shd w:fill="F8FAFC"/>
+            <w:tcBorders>
+              <w:top w:val="single" w:sz="4" w:color="D7E0EA" w:space="0"/>
+              <w:left w:val="single" w:sz="4" w:color="D7E0EA" w:space="0"/>
+              <w:bottom w:val="single" w:sz="4" w:color="D7E0EA" w:space="0"/>
+              <w:right w:val="single" w:sz="4" w:color="D7E0EA" w:space="0"/>
+              <w:insideH w:val="single" w:sz="4" w:color="D7E0EA" w:space="0"/>
+              <w:insideV w:val="single" w:sz="4" w:color="D7E0EA" w:space="0"/>
+            </w:tcBorders>
+            <w:vAlign w:val="top"/>
+          </w:tcPr>
+          <w:p>
+            <w:r>
+              <w:rPr>
+                <w:rFonts w:ascii="Liberation Sans" w:hAnsi="Liberation Sans"/>
+                <w:sz w:val="15"/>
+              </w:rPr>
+              <w:t>Creates GitHub Pages clean-route fallback</w:t>
+            </w:r>
+          </w:p>
+        </w:tc>
+        <w:tc>
+          <w:tcPr>
+            <w:tcW w:type="dxa" w:w="1531"/>
+            <w:shd w:fill="F8FAFC"/>
+            <w:tcBorders>
+              <w:top w:val="single" w:sz="4" w:color="D7E0EA" w:space="0"/>
+              <w:left w:val="single" w:sz="4" w:color="D7E0EA" w:space="0"/>
+              <w:bottom w:val="single" w:sz="4" w:color="D7E0EA" w:space="0"/>
+              <w:right w:val="single" w:sz="4" w:color="D7E0EA" w:space="0"/>
+              <w:insideH w:val="single" w:sz="4" w:color="D7E0EA" w:space="0"/>
+              <w:insideV w:val="single" w:sz="4" w:color="D7E0EA" w:space="0"/>
+            </w:tcBorders>
+            <w:vAlign w:val="top"/>
+          </w:tcPr>
+          <w:p>
+            <w:r>
+              <w:rPr>
+                <w:rFonts w:ascii="Liberation Sans" w:hAnsi="Liberation Sans"/>
+                <w:sz w:val="15"/>
+              </w:rPr>
+              <w:t>RED</w:t>
             </w:r>
           </w:p>
         </w:tc>
@@ -11747,7 +12265,7 @@
         <w:rPr>
           <w:rFonts w:ascii="Liberation Sans" w:hAnsi="Liberation Sans"/>
         </w:rPr>
-        <w:t>The main SEO description, title, keywords, canonical URL and social-sharing metadata are in public/index.html. Search-engine support files are in public/robots.txt and public/sitemap.xml. A Google Search Console verification file is already present.</w:t>
+        <w:t>SEO is split between the base page shell and the clean public routes. Page-specific titles, descriptions and canonical paths are stored in src/data/routeMeta.js and applied by src/AppRouter.jsx. Organisation/WebSite structured data is in public/index.html. Search-engine discovery files are public/robots.txt and public/sitemap.xml. Google Search Console should use Domain verification through a TXT record in the eragonova.com DNS settings.</w:t>
       </w:r>
     </w:p>
     <w:tbl>
@@ -11863,7 +12381,7 @@
                 <w:rFonts w:ascii="Liberation Sans" w:hAnsi="Liberation Sans"/>
                 <w:sz w:val="15"/>
               </w:rPr>
-              <w:t>Change Google/search description</w:t>
+              <w:t>Change a page search description</w:t>
             </w:r>
           </w:p>
         </w:tc>
@@ -11887,7 +12405,7 @@
                 <w:rFonts w:ascii="Liberation Sans" w:hAnsi="Liberation Sans"/>
                 <w:sz w:val="15"/>
               </w:rPr>
-              <w:t>public/index.html</w:t>
+              <w:t>src/data/routeMeta.js</w:t>
             </w:r>
           </w:p>
         </w:tc>
@@ -11911,7 +12429,7 @@
                 <w:rFonts w:ascii="Liberation Sans" w:hAnsi="Liberation Sans"/>
                 <w:sz w:val="15"/>
               </w:rPr>
-              <w:t>meta name="description"</w:t>
+              <w:t>Edit the description for the relevant route.</w:t>
             </w:r>
           </w:p>
         </w:tc>
@@ -11937,7 +12455,7 @@
                 <w:rFonts w:ascii="Liberation Sans" w:hAnsi="Liberation Sans"/>
                 <w:sz w:val="15"/>
               </w:rPr>
-              <w:t>Change browser/search title</w:t>
+              <w:t>Change a page browser/search title</w:t>
             </w:r>
           </w:p>
         </w:tc>
@@ -11961,7 +12479,7 @@
                 <w:rFonts w:ascii="Liberation Sans" w:hAnsi="Liberation Sans"/>
                 <w:sz w:val="15"/>
               </w:rPr>
-              <w:t>public/index.html</w:t>
+              <w:t>src/data/routeMeta.js</w:t>
             </w:r>
           </w:p>
         </w:tc>
@@ -11985,7 +12503,7 @@
                 <w:rFonts w:ascii="Liberation Sans" w:hAnsi="Liberation Sans"/>
                 <w:sz w:val="15"/>
               </w:rPr>
-              <w:t>&lt;title&gt; and og:title/twitter:title</w:t>
+              <w:t>Edit the title for the relevant route.</w:t>
             </w:r>
           </w:p>
         </w:tc>
@@ -12011,7 +12529,7 @@
                 <w:rFonts w:ascii="Liberation Sans" w:hAnsi="Liberation Sans"/>
                 <w:sz w:val="15"/>
               </w:rPr>
-              <w:t>Change social preview description</w:t>
+              <w:t>Change base social preview</w:t>
             </w:r>
           </w:p>
         </w:tc>
@@ -12059,7 +12577,7 @@
                 <w:rFonts w:ascii="Liberation Sans" w:hAnsi="Liberation Sans"/>
                 <w:sz w:val="15"/>
               </w:rPr>
-              <w:t>og:description and twitter:description</w:t>
+              <w:t>Edit the default Open Graph/Twitter values used before route JavaScript loads.</w:t>
             </w:r>
           </w:p>
         </w:tc>
@@ -12307,7 +12825,7 @@
                 <w:rFonts w:ascii="Liberation Sans" w:hAnsi="Liberation Sans"/>
                 <w:sz w:val="15"/>
               </w:rPr>
-              <w:t>Google verification</w:t>
+              <w:t>Google Search Console</w:t>
             </w:r>
           </w:p>
         </w:tc>
@@ -12331,7 +12849,7 @@
                 <w:rFonts w:ascii="Liberation Sans" w:hAnsi="Liberation Sans"/>
                 <w:sz w:val="15"/>
               </w:rPr>
-              <w:t>public/googlebcb43e0ea049d806.html</w:t>
+              <w:t>Spaceship DNS</w:t>
             </w:r>
           </w:p>
         </w:tc>
@@ -12355,7 +12873,7 @@
                 <w:rFonts w:ascii="Liberation Sans" w:hAnsi="Liberation Sans"/>
                 <w:sz w:val="15"/>
               </w:rPr>
-              <w:t>Do not remove while using this verification method</w:t>
+              <w:t>Add the TXT verification value supplied by Google for the Domain property.</w:t>
             </w:r>
           </w:p>
         </w:tc>
@@ -12383,7 +12901,7 @@
         <w:rPr>
           <w:rFonts w:ascii="Liberation Sans" w:hAnsi="Liberation Sans"/>
         </w:rPr>
-        <w:t>No Google Analytics gtag integration is currently visible in the source reviewed for this handbook. If analytics is added later, document the measurement ID location here and update the Privacy page if the tool uses cookies or collects visitor data.</w:t>
+        <w:t>Google Analytics 4 support is prepared but intentionally disabled until a real Measurement ID is available. When one is created, put it in public/site-config.js. The site will then load GA4 and record page views, contact clicks and successful contact-form leads. Review the Privacy notice before enabling any analytics or cookie-dependent features.</w:t>
       </w:r>
     </w:p>
     <w:p>
@@ -14389,7 +14907,7 @@
                 <w:rFonts w:ascii="Liberation Sans" w:hAnsi="Liberation Sans"/>
                 <w:sz w:val="15"/>
               </w:rPr>
-              <w:t>Custom domain</w:t>
+              <w:t>Google Search Console</w:t>
             </w:r>
           </w:p>
         </w:tc>
@@ -14413,7 +14931,7 @@
                 <w:rFonts w:ascii="Liberation Sans" w:hAnsi="Liberation Sans"/>
                 <w:sz w:val="15"/>
               </w:rPr>
-              <w:t>Stronger corporate identity than the GitHub Pages URL.</w:t>
+              <w:t>Helps Google discover and report on eragonova.com search performance.</w:t>
             </w:r>
           </w:p>
         </w:tc>
@@ -14437,7 +14955,7 @@
                 <w:rFonts w:ascii="Liberation Sans" w:hAnsi="Liberation Sans"/>
                 <w:sz w:val="15"/>
               </w:rPr>
-              <w:t>When domain ownership is ready.</w:t>
+              <w:t>When Google provides the DNS TXT verification record.</w:t>
             </w:r>
           </w:p>
         </w:tc>
@@ -14759,7 +15277,7 @@
                 <w:rFonts w:ascii="Liberation Sans" w:hAnsi="Liberation Sans"/>
                 <w:sz w:val="15"/>
               </w:rPr>
-              <w:t>Structured SEO per route</w:t>
+              <w:t>SEO review and content growth</w:t>
             </w:r>
           </w:p>
         </w:tc>
@@ -14783,7 +15301,7 @@
                 <w:rFonts w:ascii="Liberation Sans" w:hAnsi="Liberation Sans"/>
                 <w:sz w:val="15"/>
               </w:rPr>
-              <w:t>Improves search targeting beyond one HTML metadata shell.</w:t>
+              <w:t>Keeps route metadata, schema, resources and search targeting aligned with the business.</w:t>
             </w:r>
           </w:p>
         </w:tc>
@@ -14807,7 +15325,7 @@
                 <w:rFonts w:ascii="Liberation Sans" w:hAnsi="Liberation Sans"/>
                 <w:sz w:val="15"/>
               </w:rPr>
-              <w:t>When SEO becomes a dedicated growth channel.</w:t>
+              <w:t>Review quarterly or when major services change.</w:t>
             </w:r>
           </w:p>
         </w:tc>
@@ -16229,6 +16747,7 @@
                 <w:rFonts w:ascii="Liberation Sans" w:hAnsi="Liberation Sans"/>
                 <w:sz w:val="15"/>
               </w:rPr>
+              <w:t>13 Oct 2026</w:t>
             </w:r>
           </w:p>
         </w:tc>
@@ -16252,6 +16771,7 @@
                 <w:rFonts w:ascii="Liberation Sans" w:hAnsi="Liberation Sans"/>
                 <w:sz w:val="15"/>
               </w:rPr>
+              <w:t>Website upgrade</w:t>
             </w:r>
           </w:p>
         </w:tc>
@@ -16275,6 +16795,7 @@
                 <w:rFonts w:ascii="Liberation Sans" w:hAnsi="Liberation Sans"/>
                 <w:sz w:val="15"/>
               </w:rPr>
+              <w:t>routing / SEO / accessibility / contact</w:t>
             </w:r>
           </w:p>
         </w:tc>
@@ -16298,6 +16819,7 @@
                 <w:rFonts w:ascii="Liberation Sans" w:hAnsi="Liberation Sans"/>
                 <w:sz w:val="15"/>
               </w:rPr>
+              <w:t>Moved to eragonova.com clean URLs, route SEO, schema, accessibility improvements, analytics readiness and contact-form privacy/spam protection.</w:t>
             </w:r>
           </w:p>
         </w:tc>
@@ -16321,6 +16843,7 @@
                 <w:rFonts w:ascii="Liberation Sans" w:hAnsi="Liberation Sans"/>
                 <w:sz w:val="15"/>
               </w:rPr>
+              <w:t>Updated after custom-domain launch.</w:t>
             </w:r>
           </w:p>
         </w:tc>
@@ -16773,6 +17296,123 @@
           <w:tcPr>
             <w:tcW w:type="dxa" w:w="2268"/>
             <w:shd w:fill="F8FAFC"/>
+            <w:tcBorders>
+              <w:top w:val="single" w:sz="4" w:color="D7E0EA" w:space="0"/>
+              <w:left w:val="single" w:sz="4" w:color="D7E0EA" w:space="0"/>
+              <w:bottom w:val="single" w:sz="4" w:color="D7E0EA" w:space="0"/>
+              <w:right w:val="single" w:sz="4" w:color="D7E0EA" w:space="0"/>
+              <w:insideH w:val="single" w:sz="4" w:color="D7E0EA" w:space="0"/>
+              <w:insideV w:val="single" w:sz="4" w:color="D7E0EA" w:space="0"/>
+            </w:tcBorders>
+            <w:vAlign w:val="top"/>
+          </w:tcPr>
+          <w:p>
+            <w:r>
+              <w:rPr>
+                <w:rFonts w:ascii="Liberation Sans" w:hAnsi="Liberation Sans"/>
+                <w:sz w:val="15"/>
+              </w:rPr>
+            </w:r>
+          </w:p>
+        </w:tc>
+      </w:tr>
+      <w:tr>
+        <w:tc>
+          <w:tcPr>
+            <w:tcW w:type="dxa" w:w="1417"/>
+            <w:shd w:fill="FFFFFF"/>
+            <w:tcBorders>
+              <w:top w:val="single" w:sz="4" w:color="D7E0EA" w:space="0"/>
+              <w:left w:val="single" w:sz="4" w:color="D7E0EA" w:space="0"/>
+              <w:bottom w:val="single" w:sz="4" w:color="D7E0EA" w:space="0"/>
+              <w:right w:val="single" w:sz="4" w:color="D7E0EA" w:space="0"/>
+              <w:insideH w:val="single" w:sz="4" w:color="D7E0EA" w:space="0"/>
+              <w:insideV w:val="single" w:sz="4" w:color="D7E0EA" w:space="0"/>
+            </w:tcBorders>
+            <w:vAlign w:val="top"/>
+          </w:tcPr>
+          <w:p>
+            <w:r>
+              <w:rPr>
+                <w:rFonts w:ascii="Liberation Sans" w:hAnsi="Liberation Sans"/>
+                <w:sz w:val="15"/>
+              </w:rPr>
+            </w:r>
+          </w:p>
+        </w:tc>
+        <w:tc>
+          <w:tcPr>
+            <w:tcW w:type="dxa" w:w="1701"/>
+            <w:shd w:fill="FFFFFF"/>
+            <w:tcBorders>
+              <w:top w:val="single" w:sz="4" w:color="D7E0EA" w:space="0"/>
+              <w:left w:val="single" w:sz="4" w:color="D7E0EA" w:space="0"/>
+              <w:bottom w:val="single" w:sz="4" w:color="D7E0EA" w:space="0"/>
+              <w:right w:val="single" w:sz="4" w:color="D7E0EA" w:space="0"/>
+              <w:insideH w:val="single" w:sz="4" w:color="D7E0EA" w:space="0"/>
+              <w:insideV w:val="single" w:sz="4" w:color="D7E0EA" w:space="0"/>
+            </w:tcBorders>
+            <w:vAlign w:val="top"/>
+          </w:tcPr>
+          <w:p>
+            <w:r>
+              <w:rPr>
+                <w:rFonts w:ascii="Liberation Sans" w:hAnsi="Liberation Sans"/>
+                <w:sz w:val="15"/>
+              </w:rPr>
+            </w:r>
+          </w:p>
+        </w:tc>
+        <w:tc>
+          <w:tcPr>
+            <w:tcW w:type="dxa" w:w="1984"/>
+            <w:shd w:fill="FFFFFF"/>
+            <w:tcBorders>
+              <w:top w:val="single" w:sz="4" w:color="D7E0EA" w:space="0"/>
+              <w:left w:val="single" w:sz="4" w:color="D7E0EA" w:space="0"/>
+              <w:bottom w:val="single" w:sz="4" w:color="D7E0EA" w:space="0"/>
+              <w:right w:val="single" w:sz="4" w:color="D7E0EA" w:space="0"/>
+              <w:insideH w:val="single" w:sz="4" w:color="D7E0EA" w:space="0"/>
+              <w:insideV w:val="single" w:sz="4" w:color="D7E0EA" w:space="0"/>
+            </w:tcBorders>
+            <w:vAlign w:val="top"/>
+          </w:tcPr>
+          <w:p>
+            <w:r>
+              <w:rPr>
+                <w:rFonts w:ascii="Liberation Sans" w:hAnsi="Liberation Sans"/>
+                <w:sz w:val="15"/>
+              </w:rPr>
+            </w:r>
+          </w:p>
+        </w:tc>
+        <w:tc>
+          <w:tcPr>
+            <w:tcW w:type="dxa" w:w="2551"/>
+            <w:shd w:fill="FFFFFF"/>
+            <w:tcBorders>
+              <w:top w:val="single" w:sz="4" w:color="D7E0EA" w:space="0"/>
+              <w:left w:val="single" w:sz="4" w:color="D7E0EA" w:space="0"/>
+              <w:bottom w:val="single" w:sz="4" w:color="D7E0EA" w:space="0"/>
+              <w:right w:val="single" w:sz="4" w:color="D7E0EA" w:space="0"/>
+              <w:insideH w:val="single" w:sz="4" w:color="D7E0EA" w:space="0"/>
+              <w:insideV w:val="single" w:sz="4" w:color="D7E0EA" w:space="0"/>
+            </w:tcBorders>
+            <w:vAlign w:val="top"/>
+          </w:tcPr>
+          <w:p>
+            <w:r>
+              <w:rPr>
+                <w:rFonts w:ascii="Liberation Sans" w:hAnsi="Liberation Sans"/>
+                <w:sz w:val="15"/>
+              </w:rPr>
+            </w:r>
+          </w:p>
+        </w:tc>
+        <w:tc>
+          <w:tcPr>
+            <w:tcW w:type="dxa" w:w="2268"/>
+            <w:shd w:fill="FFFFFF"/>
             <w:tcBorders>
               <w:top w:val="single" w:sz="4" w:color="D7E0EA" w:space="0"/>
               <w:left w:val="single" w:sz="4" w:color="D7E0EA" w:space="0"/>
@@ -16889,7 +17529,7 @@
         <w:rPr>
           <w:rFonts w:ascii="Liberation Sans" w:hAnsi="Liberation Sans"/>
         </w:rPr>
-        <w:t>I know public/index.html controls the main SEO/social metadata.</w:t>
+        <w:t>I know src/data/routeMeta.js controls page-specific SEO while public/index.html contains the base organisation/social metadata.</w:t>
       </w:r>
     </w:p>
     <w:p>

</xml_diff>